<commit_message>
Added more data, fixed wrong image channel in analysis!!!!
</commit_message>
<xml_diff>
--- a/Results/Mitosections/mitochondria_alcohol_status_report.docx
+++ b/Results/Mitosections/mitochondria_alcohol_status_report.docx
@@ -91,7 +91,7 @@
         <w:pStyle w:val="Datum"/>
       </w:pPr>
       <w:r>
-        <w:t xml:space="preserve">2023-04-22</w:t>
+        <w:t xml:space="preserve">2023-05-23</w:t>
       </w:r>
     </w:p>
     <w:bookmarkStart w:id="28" w:name="introduction"/>
@@ -264,7 +264,7 @@
         <w:pStyle w:val="FirstParagraph"/>
       </w:pPr>
       <w:r>
-        <w:t xml:space="preserve">The number of analyzed images is currently 50 and is divided into different experimental conditions as follows:</w:t>
+        <w:t xml:space="preserve">The number of analyzed images is currently 109 and is divided into different experimental conditions as follows:</w:t>
       </w:r>
     </w:p>
     <w:tbl>
@@ -302,6 +302,32 @@
             </w:pPr>
             <w:r>
               <w:t xml:space="preserve">n</w:t>
+            </w:r>
+          </w:p>
+        </w:tc>
+      </w:tr>
+      <w:tr>
+        <w:tc>
+          <w:tcPr/>
+          <w:p>
+            <w:pPr>
+              <w:pStyle w:val="Compact"/>
+              <w:jc w:val="center"/>
+            </w:pPr>
+            <w:r>
+              <w:t xml:space="preserve">Activin 50ng/ml 10d</w:t>
+            </w:r>
+          </w:p>
+        </w:tc>
+        <w:tc>
+          <w:tcPr/>
+          <w:p>
+            <w:pPr>
+              <w:pStyle w:val="Compact"/>
+              <w:jc w:val="center"/>
+            </w:pPr>
+            <w:r>
+              <w:t xml:space="preserve">6</w:t>
             </w:r>
           </w:p>
         </w:tc>
@@ -367,6 +393,58 @@
               <w:jc w:val="center"/>
             </w:pPr>
             <w:r>
+              <w:t xml:space="preserve">Activin 50ng/ml 4d</w:t>
+            </w:r>
+          </w:p>
+        </w:tc>
+        <w:tc>
+          <w:tcPr/>
+          <w:p>
+            <w:pPr>
+              <w:pStyle w:val="Compact"/>
+              <w:jc w:val="center"/>
+            </w:pPr>
+            <w:r>
+              <w:t xml:space="preserve">12</w:t>
+            </w:r>
+          </w:p>
+        </w:tc>
+      </w:tr>
+      <w:tr>
+        <w:tc>
+          <w:tcPr/>
+          <w:p>
+            <w:pPr>
+              <w:pStyle w:val="Compact"/>
+              <w:jc w:val="center"/>
+            </w:pPr>
+            <w:r>
+              <w:t xml:space="preserve">Control 10d</w:t>
+            </w:r>
+          </w:p>
+        </w:tc>
+        <w:tc>
+          <w:tcPr/>
+          <w:p>
+            <w:pPr>
+              <w:pStyle w:val="Compact"/>
+              <w:jc w:val="center"/>
+            </w:pPr>
+            <w:r>
+              <w:t xml:space="preserve">11</w:t>
+            </w:r>
+          </w:p>
+        </w:tc>
+      </w:tr>
+      <w:tr>
+        <w:tc>
+          <w:tcPr/>
+          <w:p>
+            <w:pPr>
+              <w:pStyle w:val="Compact"/>
+              <w:jc w:val="center"/>
+            </w:pPr>
+            <w:r>
               <w:t xml:space="preserve">Control 14days</w:t>
             </w:r>
           </w:p>
@@ -406,6 +484,110 @@
             </w:pPr>
             <w:r>
               <w:t xml:space="preserve">10</w:t>
+            </w:r>
+          </w:p>
+        </w:tc>
+      </w:tr>
+      <w:tr>
+        <w:tc>
+          <w:tcPr/>
+          <w:p>
+            <w:pPr>
+              <w:pStyle w:val="Compact"/>
+              <w:jc w:val="center"/>
+            </w:pPr>
+            <w:r>
+              <w:t xml:space="preserve">Ctrl 4d</w:t>
+            </w:r>
+          </w:p>
+        </w:tc>
+        <w:tc>
+          <w:tcPr/>
+          <w:p>
+            <w:pPr>
+              <w:pStyle w:val="Compact"/>
+              <w:jc w:val="center"/>
+            </w:pPr>
+            <w:r>
+              <w:t xml:space="preserve">11</w:t>
+            </w:r>
+          </w:p>
+        </w:tc>
+      </w:tr>
+      <w:tr>
+        <w:tc>
+          <w:tcPr/>
+          <w:p>
+            <w:pPr>
+              <w:pStyle w:val="Compact"/>
+              <w:jc w:val="center"/>
+            </w:pPr>
+            <w:r>
+              <w:t xml:space="preserve">Ctrl 5min</w:t>
+            </w:r>
+          </w:p>
+        </w:tc>
+        <w:tc>
+          <w:tcPr/>
+          <w:p>
+            <w:pPr>
+              <w:pStyle w:val="Compact"/>
+              <w:jc w:val="center"/>
+            </w:pPr>
+            <w:r>
+              <w:t xml:space="preserve">1</w:t>
+            </w:r>
+          </w:p>
+        </w:tc>
+      </w:tr>
+      <w:tr>
+        <w:tc>
+          <w:tcPr/>
+          <w:p>
+            <w:pPr>
+              <w:pStyle w:val="Compact"/>
+              <w:jc w:val="center"/>
+            </w:pPr>
+            <w:r>
+              <w:t xml:space="preserve">Ethanol 30mM 5min</w:t>
+            </w:r>
+          </w:p>
+        </w:tc>
+        <w:tc>
+          <w:tcPr/>
+          <w:p>
+            <w:pPr>
+              <w:pStyle w:val="Compact"/>
+              <w:jc w:val="center"/>
+            </w:pPr>
+            <w:r>
+              <w:t xml:space="preserve">7</w:t>
+            </w:r>
+          </w:p>
+        </w:tc>
+      </w:tr>
+      <w:tr>
+        <w:tc>
+          <w:tcPr/>
+          <w:p>
+            <w:pPr>
+              <w:pStyle w:val="Compact"/>
+              <w:jc w:val="center"/>
+            </w:pPr>
+            <w:r>
+              <w:t xml:space="preserve">Follistatin 50ng/ml 10d</w:t>
+            </w:r>
+          </w:p>
+        </w:tc>
+        <w:tc>
+          <w:tcPr/>
+          <w:p>
+            <w:pPr>
+              <w:pStyle w:val="Compact"/>
+              <w:jc w:val="center"/>
+            </w:pPr>
+            <w:r>
+              <w:t xml:space="preserve">5</w:t>
             </w:r>
           </w:p>
         </w:tc>
@@ -488,10 +670,62 @@
           </w:p>
         </w:tc>
       </w:tr>
+      <w:tr>
+        <w:tc>
+          <w:tcPr/>
+          <w:p>
+            <w:pPr>
+              <w:pStyle w:val="Compact"/>
+              <w:jc w:val="center"/>
+            </w:pPr>
+            <w:r>
+              <w:t xml:space="preserve">SMIFH2 10µM 4d</w:t>
+            </w:r>
+          </w:p>
+        </w:tc>
+        <w:tc>
+          <w:tcPr/>
+          <w:p>
+            <w:pPr>
+              <w:pStyle w:val="Compact"/>
+              <w:jc w:val="center"/>
+            </w:pPr>
+            <w:r>
+              <w:t xml:space="preserve">2</w:t>
+            </w:r>
+          </w:p>
+        </w:tc>
+      </w:tr>
+      <w:tr>
+        <w:tc>
+          <w:tcPr/>
+          <w:p>
+            <w:pPr>
+              <w:pStyle w:val="Compact"/>
+              <w:jc w:val="center"/>
+            </w:pPr>
+            <w:r>
+              <w:t xml:space="preserve">SMIFH2 10µm 10d</w:t>
+            </w:r>
+          </w:p>
+        </w:tc>
+        <w:tc>
+          <w:tcPr/>
+          <w:p>
+            <w:pPr>
+              <w:pStyle w:val="Compact"/>
+              <w:jc w:val="center"/>
+            </w:pPr>
+            <w:r>
+              <w:t xml:space="preserve">4</w:t>
+            </w:r>
+          </w:p>
+        </w:tc>
+      </w:tr>
     </w:tbl>
     <w:bookmarkEnd w:id="27"/>
     <w:bookmarkEnd w:id="28"/>
-    <w:bookmarkStart w:id="47" w:name="analysis-steps"/>
+    <w:bookmarkStart w:id="41" w:name="analysis-steps"/>
     <w:p>
       <w:pPr>
         <w:pStyle w:val="berschrift2"/>
@@ -505,7 +739,7 @@
         <w:pStyle w:val="FirstParagraph"/>
       </w:pPr>
       <w:r>
-        <w:t xml:space="preserve">A user blinded to the experimental condition marked a starting point at the nuclear envelope and an endpoint at the somatic cell membrane. We then analyzed the green fluorescence intensity distribution along the connecting line as a marker for the distribution of mitochondria.</w:t>
+        <w:t xml:space="preserve">A user blinded to the experimental condition marked a starting point at the nuclear envelope and an endpoint at the somatic cell membrane. We then analyzed the fluorescence intensity distribution along the connecting line as a marker for the distribution of mitochondria.</w:t>
       </w:r>
     </w:p>
     <w:bookmarkStart w:id="29" w:name="intensity-profiles"/>
@@ -692,7 +926,7 @@
         <w:pStyle w:val="Textkrper"/>
       </w:pPr>
       <w:r>
-        <w:t xml:space="preserve">We can see, that some curves consist of very few data points, because the soma is only a thin edge around the nucleus in some regions. Other sections span across wider sections of soma. Overal there seems to be no particular difference between line 1 (sections across widest area of the soma) and lines 2 and 3 (sections across other parts of the soma).</w:t>
+        <w:t xml:space="preserve">We can see, that some curves consist of very few data points, because the soma is only a thin edge around the nucleus in some regions. Other sections span across wider sections of soma. Overall there is no apparent difference between line 1 (sections across widest area of the soma) and lines 2 and 3 (sections across other parts of the soma).</w:t>
       </w:r>
     </w:p>
     <w:p>
@@ -759,7 +993,7 @@
       </w:r>
     </w:p>
     <w:bookmarkEnd w:id="39"/>
-    <w:bookmarkStart w:id="46" w:name="statistical-comparison"/>
+    <w:bookmarkStart w:id="40" w:name="statistical-comparison"/>
     <w:p>
       <w:pPr>
         <w:pStyle w:val="berschrift3"/>
@@ -774,6 +1008,32 @@
       </w:pPr>
       <w:r>
         <w:t xml:space="preserve">To compare the different distributions, we divided them up into 10 sections (0-0.1 distance from the nucleus, 0.1-0.2, 0.2-0.3,…). Within each section, values are averaged and statistically compared through anova with Dunnett’s post-hoc corrections (used when comparing multiple treatment conditions to one control).</w:t>
+      </w:r>
+      <w:r>
+        <w:t xml:space="preserve"> </w:t>
+      </w:r>
+      <w:r>
+        <w:t xml:space="preserve">I then performed statistical comparison between the different treatment groups and controls for each of the 10 distance sections.</w:t>
+      </w:r>
+    </w:p>
+    <w:bookmarkEnd w:id="40"/>
+    <w:bookmarkEnd w:id="41"/>
+    <w:bookmarkStart w:id="70" w:name="current-results"/>
+    <w:p>
+      <w:pPr>
+        <w:pStyle w:val="berschrift2"/>
+      </w:pPr>
+      <w:r>
+        <w:t xml:space="preserve">Current results</w:t>
+      </w:r>
+    </w:p>
+    <w:bookmarkStart w:id="48" w:name="X58f9943709f66ae693e655b336e2a06c0f86bc7"/>
+    <w:p>
+      <w:pPr>
+        <w:pStyle w:val="berschrift3"/>
+      </w:pPr>
+      <w:r>
+        <w:t xml:space="preserve">Reduced somatic actin density in cultures treated with Activin A for 2 days and for 14 days, but not in between at 4 days and 10 days</w:t>
       </w:r>
     </w:p>
     <w:p>
@@ -783,20 +1043,20 @@
       <w:r>
         <w:drawing>
           <wp:inline>
-            <wp:extent cx="5969000" cy="5372100"/>
+            <wp:extent cx="5969000" cy="7022352"/>
             <wp:effectExtent b="0" l="0" r="0" t="0"/>
-            <wp:docPr descr="Correlation of the different curves" title="" id="41" name="Picture"/>
+            <wp:docPr descr="Statistical comparison of actin density in Activin A treated cultures" title="" id="43" name="Picture"/>
             <a:graphic>
               <a:graphicData uri="http://schemas.openxmlformats.org/drawingml/2006/picture">
                 <pic:pic>
                   <pic:nvPicPr>
-                    <pic:cNvPr descr="mitochondria_alcohol_status_report_files/figure-docx/comparison_of_curve_sections-1.png" id="42" name="Picture"/>
+                    <pic:cNvPr descr="mitochondria_alcohol_status_report_files/figure-docx/comparison_actin_under_activin-1.png" id="44" name="Picture"/>
                     <pic:cNvPicPr>
                       <a:picLocks noChangeArrowheads="1" noChangeAspect="1"/>
                     </pic:cNvPicPr>
                   </pic:nvPicPr>
                   <pic:blipFill>
-                    <a:blip r:embed="rId40"/>
+                    <a:blip r:embed="rId42"/>
                     <a:stretch>
                       <a:fillRect/>
                     </a:stretch>
@@ -804,7 +1064,7 @@
                   <pic:spPr bwMode="auto">
                     <a:xfrm>
                       <a:off x="0" y="0"/>
-                      <a:ext cx="5969000" cy="5372100"/>
+                      <a:ext cx="5969000" cy="7022352"/>
                     </a:xfrm>
                     <a:prstGeom prst="rect">
                       <a:avLst/>
@@ -828,15 +1088,7 @@
         <w:pStyle w:val="ImageCaption"/>
       </w:pPr>
       <w:r>
-        <w:t xml:space="preserve">Correlation of the different curves</w:t>
-      </w:r>
-    </w:p>
-    <w:p>
-      <w:pPr>
-        <w:pStyle w:val="Textkrper"/>
-      </w:pPr>
-      <w:r>
-        <w:t xml:space="preserve">I then performed statistical comparison between the different tratment groups and controls for each of the 10 distance sections:</w:t>
+        <w:t xml:space="preserve">Statistical comparison of actin density in Activin A treated cultures</w:t>
       </w:r>
     </w:p>
     <w:p>
@@ -846,160 +1098,20 @@
       <w:r>
         <w:drawing>
           <wp:inline>
-            <wp:extent cx="5969000" cy="8426823"/>
+            <wp:extent cx="5969000" cy="4178300"/>
             <wp:effectExtent b="0" l="0" r="0" t="0"/>
-            <wp:docPr descr="Statistical comparison of different conditions for each section" title="" id="44" name="Picture"/>
+            <wp:docPr descr="Actin density in the soma of Activin A treated cultures" title="" id="46" name="Picture"/>
             <a:graphic>
               <a:graphicData uri="http://schemas.openxmlformats.org/drawingml/2006/picture">
                 <pic:pic>
                   <pic:nvPicPr>
-                    <pic:cNvPr descr="mitochondria_alcohol_status_report_files/figure-docx/separate_section_plots_stats-1.png" id="45" name="Picture"/>
+                    <pic:cNvPr descr="mitochondria_alcohol_status_report_files/figure-docx/actin_in_activin-1.png" id="47" name="Picture"/>
                     <pic:cNvPicPr>
                       <a:picLocks noChangeArrowheads="1" noChangeAspect="1"/>
                     </pic:cNvPicPr>
                   </pic:nvPicPr>
                   <pic:blipFill>
-                    <a:blip r:embed="rId43"/>
-                    <a:stretch>
-                      <a:fillRect/>
-                    </a:stretch>
-                  </pic:blipFill>
-                  <pic:spPr bwMode="auto">
-                    <a:xfrm>
-                      <a:off x="0" y="0"/>
-                      <a:ext cx="5969000" cy="8426823"/>
-                    </a:xfrm>
-                    <a:prstGeom prst="rect">
-                      <a:avLst/>
-                    </a:prstGeom>
-                    <a:noFill/>
-                    <a:ln w="9525">
-                      <a:noFill/>
-                      <a:headEnd/>
-                      <a:tailEnd/>
-                    </a:ln>
-                  </pic:spPr>
-                </pic:pic>
-              </a:graphicData>
-            </a:graphic>
-          </wp:inline>
-        </w:drawing>
-      </w:r>
-    </w:p>
-    <w:p>
-      <w:pPr>
-        <w:pStyle w:val="ImageCaption"/>
-      </w:pPr>
-      <w:r>
-        <w:t xml:space="preserve">Statistical comparison of different conditions for each section</w:t>
-      </w:r>
-    </w:p>
-    <w:p>
-      <w:pPr>
-        <w:pStyle w:val="Textkrper"/>
-      </w:pPr>
-      <w:r>
-        <w:t xml:space="preserve">Note that for a quick first overview, all conditions are compared to</w:t>
-      </w:r>
-      <w:r>
-        <w:t xml:space="preserve"> </w:t>
-      </w:r>
-      <w:r>
-        <w:t xml:space="preserve">“</w:t>
-      </w:r>
-      <w:r>
-        <w:t xml:space="preserve">Control 14 days</w:t>
-      </w:r>
-      <w:r>
-        <w:t xml:space="preserve">”</w:t>
-      </w:r>
-      <w:r>
-        <w:t xml:space="preserve"> </w:t>
-      </w:r>
-      <w:r>
-        <w:t xml:space="preserve">which is not entirely correct.</w:t>
-      </w:r>
-      <w:r>
-        <w:t xml:space="preserve"> </w:t>
-      </w:r>
-      <w:r>
-        <w:t xml:space="preserve">Also, in section 9 there seems to be a statistically significant difference between</w:t>
-      </w:r>
-      <w:r>
-        <w:t xml:space="preserve"> </w:t>
-      </w:r>
-      <w:r>
-        <w:t xml:space="preserve">“</w:t>
-      </w:r>
-      <w:r>
-        <w:t xml:space="preserve">Control 14 days</w:t>
-      </w:r>
-      <w:r>
-        <w:t xml:space="preserve">”</w:t>
-      </w:r>
-      <w:r>
-        <w:t xml:space="preserve"> </w:t>
-      </w:r>
-      <w:r>
-        <w:t xml:space="preserve">and</w:t>
-      </w:r>
-      <w:r>
-        <w:t xml:space="preserve"> </w:t>
-      </w:r>
-      <w:r>
-        <w:t xml:space="preserve">“</w:t>
-      </w:r>
-      <w:r>
-        <w:t xml:space="preserve">Control 7 days</w:t>
-      </w:r>
-      <w:r>
-        <w:t xml:space="preserve">”</w:t>
-      </w:r>
-      <w:r>
-        <w:t xml:space="preserve">, which are both just untreated cultures. This might indicate that we need more data, to have sound statistical testing results.</w:t>
-      </w:r>
-    </w:p>
-    <w:bookmarkEnd w:id="46"/>
-    <w:bookmarkEnd w:id="47"/>
-    <w:bookmarkStart w:id="56" w:name="current-results"/>
-    <w:p>
-      <w:pPr>
-        <w:pStyle w:val="berschrift2"/>
-      </w:pPr>
-      <w:r>
-        <w:t xml:space="preserve">Current results</w:t>
-      </w:r>
-    </w:p>
-    <w:bookmarkStart w:id="51" w:name="X93b4b2936fe9c5cbc52d727f1584104ea5d2d6c"/>
-    <w:p>
-      <w:pPr>
-        <w:pStyle w:val="berschrift3"/>
-      </w:pPr>
-      <w:r>
-        <w:t xml:space="preserve">In Activin treated cultures, the overall mitochondria population is decreased:</w:t>
-      </w:r>
-    </w:p>
-    <w:p>
-      <w:pPr>
-        <w:pStyle w:val="CaptionedFigure"/>
-      </w:pPr>
-      <w:r>
-        <w:drawing>
-          <wp:inline>
-            <wp:extent cx="5969000" cy="4178300"/>
-            <wp:effectExtent b="0" l="0" r="0" t="0"/>
-            <wp:docPr descr="Reduced mitochondria population in the soma of Activin A treated cultures" title="" id="49" name="Picture"/>
-            <a:graphic>
-              <a:graphicData uri="http://schemas.openxmlformats.org/drawingml/2006/picture">
-                <pic:pic>
-                  <pic:nvPicPr>
-                    <pic:cNvPr descr="mitochondria_alcohol_status_report_files/figure-docx/reduced_mito_in_activin-1.png" id="50" name="Picture"/>
-                    <pic:cNvPicPr>
-                      <a:picLocks noChangeArrowheads="1" noChangeAspect="1"/>
-                    </pic:cNvPicPr>
-                  </pic:nvPicPr>
-                  <pic:blipFill>
-                    <a:blip r:embed="rId48"/>
+                    <a:blip r:embed="rId45"/>
                     <a:stretch>
                       <a:fillRect/>
                     </a:stretch>
@@ -1031,7 +1143,7 @@
         <w:pStyle w:val="ImageCaption"/>
       </w:pPr>
       <w:r>
-        <w:t xml:space="preserve">Reduced mitochondria population in the soma of Activin A treated cultures</w:t>
+        <w:t xml:space="preserve">Actin density in the soma of Activin A treated cultures</w:t>
       </w:r>
     </w:p>
     <w:p>
@@ -1039,17 +1151,72 @@
         <w:pStyle w:val="Textkrper"/>
       </w:pPr>
       <w:r>
-        <w:t xml:space="preserve">Cultures treated with Activin A for 2 days and for 14 days have decreased overall population of mitochondria in the soma. The effect seems smaller around the nucleus (distance 1-5) and more pronounced towards the outskrits of the soma (distance 5-10).</w:t>
-      </w:r>
-    </w:p>
-    <w:bookmarkEnd w:id="51"/>
-    <w:bookmarkStart w:id="55" w:name="X826207b617a495821db7f9506b75f41831117b9"/>
+        <w:t xml:space="preserve">Cultures treated with Activin A for 2 days contain a reduced somatic actin density. This effect recedes to no changes after 4 days and 10 days of treatment and reappears after 14 days.</w:t>
+      </w:r>
+    </w:p>
+    <w:bookmarkEnd w:id="48"/>
+    <w:bookmarkStart w:id="55" w:name="Xdcc0b50835011dc7051615fd3c5cb7a52061c43"/>
     <w:p>
       <w:pPr>
         <w:pStyle w:val="berschrift3"/>
       </w:pPr>
       <w:r>
-        <w:t xml:space="preserve">Follistatin does not affect somatic mitochondrial population of neurons</w:t>
+        <w:t xml:space="preserve">No relevant effect of follistatin on actin density</w:t>
+      </w:r>
+    </w:p>
+    <w:p>
+      <w:pPr>
+        <w:pStyle w:val="CaptionedFigure"/>
+      </w:pPr>
+      <w:r>
+        <w:drawing>
+          <wp:inline>
+            <wp:extent cx="5969000" cy="7022352"/>
+            <wp:effectExtent b="0" l="0" r="0" t="0"/>
+            <wp:docPr descr="Statistical comparison of actin density in follistatin treated cultures" title="" id="50" name="Picture"/>
+            <a:graphic>
+              <a:graphicData uri="http://schemas.openxmlformats.org/drawingml/2006/picture">
+                <pic:pic>
+                  <pic:nvPicPr>
+                    <pic:cNvPr descr="mitochondria_alcohol_status_report_files/figure-docx/comparison_actin_under_follistatin-1.png" id="51" name="Picture"/>
+                    <pic:cNvPicPr>
+                      <a:picLocks noChangeArrowheads="1" noChangeAspect="1"/>
+                    </pic:cNvPicPr>
+                  </pic:nvPicPr>
+                  <pic:blipFill>
+                    <a:blip r:embed="rId49"/>
+                    <a:stretch>
+                      <a:fillRect/>
+                    </a:stretch>
+                  </pic:blipFill>
+                  <pic:spPr bwMode="auto">
+                    <a:xfrm>
+                      <a:off x="0" y="0"/>
+                      <a:ext cx="5969000" cy="7022352"/>
+                    </a:xfrm>
+                    <a:prstGeom prst="rect">
+                      <a:avLst/>
+                    </a:prstGeom>
+                    <a:noFill/>
+                    <a:ln w="9525">
+                      <a:noFill/>
+                      <a:headEnd/>
+                      <a:tailEnd/>
+                    </a:ln>
+                  </pic:spPr>
+                </pic:pic>
+              </a:graphicData>
+            </a:graphic>
+          </wp:inline>
+        </w:drawing>
+      </w:r>
+    </w:p>
+    <w:p>
+      <w:pPr>
+        <w:pStyle w:val="ImageCaption"/>
+      </w:pPr>
+      <w:r>
+        <w:t xml:space="preserve">Statistical comparison of actin density in follistatin treated cultures</w:t>
       </w:r>
     </w:p>
     <w:p>
@@ -1061,12 +1228,12 @@
           <wp:inline>
             <wp:extent cx="5969000" cy="4178300"/>
             <wp:effectExtent b="0" l="0" r="0" t="0"/>
-            <wp:docPr descr="Maintained mitochondria population in the soma of Follistatin treated cultures" title="" id="53" name="Picture"/>
+            <wp:docPr descr="Actin density in the soma of follistatin treated cultures" title="" id="53" name="Picture"/>
             <a:graphic>
               <a:graphicData uri="http://schemas.openxmlformats.org/drawingml/2006/picture">
                 <pic:pic>
                   <pic:nvPicPr>
-                    <pic:cNvPr descr="mitochondria_alcohol_status_report_files/figure-docx/increased_mito_in_follistatin-1.png" id="54" name="Picture"/>
+                    <pic:cNvPr descr="mitochondria_alcohol_status_report_files/figure-docx/actin_in_follistatin-1.png" id="54" name="Picture"/>
                     <pic:cNvPicPr>
                       <a:picLocks noChangeArrowheads="1" noChangeAspect="1"/>
                     </pic:cNvPicPr>
@@ -1104,65 +1271,286 @@
         <w:pStyle w:val="ImageCaption"/>
       </w:pPr>
       <w:r>
-        <w:t xml:space="preserve">Maintained mitochondria population in the soma of Follistatin treated cultures</w:t>
+        <w:t xml:space="preserve">Actin density in the soma of follistatin treated cultures</w:t>
+      </w:r>
+    </w:p>
+    <w:p>
+      <w:pPr>
+        <w:pStyle w:val="Textkrper"/>
+      </w:pPr>
+      <w:r>
+        <w:t xml:space="preserve">Although statistically significant, effect sizes are minimal and thus, cultures treated with follistatin up to 14 days show no noteworthy effects of the treatment on somatic actin density.</w:t>
       </w:r>
     </w:p>
     <w:bookmarkEnd w:id="55"/>
-    <w:bookmarkEnd w:id="56"/>
-    <w:bookmarkStart w:id="57" w:name="next-steps"/>
+    <w:bookmarkStart w:id="62" w:name="Xe50f6a54b942b943f33e685b1f768689b30252f"/>
+    <w:p>
+      <w:pPr>
+        <w:pStyle w:val="berschrift3"/>
+      </w:pPr>
+      <w:r>
+        <w:t xml:space="preserve">Inconclusive results of actin density in SMIFH2 treated cultures</w:t>
+      </w:r>
+    </w:p>
+    <w:p>
+      <w:pPr>
+        <w:pStyle w:val="CaptionedFigure"/>
+      </w:pPr>
+      <w:r>
+        <w:drawing>
+          <wp:inline>
+            <wp:extent cx="5969000" cy="7022352"/>
+            <wp:effectExtent b="0" l="0" r="0" t="0"/>
+            <wp:docPr descr="Statistical comparison of actin density in SMIFH2 treated cultures" title="" id="57" name="Picture"/>
+            <a:graphic>
+              <a:graphicData uri="http://schemas.openxmlformats.org/drawingml/2006/picture">
+                <pic:pic>
+                  <pic:nvPicPr>
+                    <pic:cNvPr descr="mitochondria_alcohol_status_report_files/figure-docx/comparison_actin_under_SMIFH2-1.png" id="58" name="Picture"/>
+                    <pic:cNvPicPr>
+                      <a:picLocks noChangeArrowheads="1" noChangeAspect="1"/>
+                    </pic:cNvPicPr>
+                  </pic:nvPicPr>
+                  <pic:blipFill>
+                    <a:blip r:embed="rId56"/>
+                    <a:stretch>
+                      <a:fillRect/>
+                    </a:stretch>
+                  </pic:blipFill>
+                  <pic:spPr bwMode="auto">
+                    <a:xfrm>
+                      <a:off x="0" y="0"/>
+                      <a:ext cx="5969000" cy="7022352"/>
+                    </a:xfrm>
+                    <a:prstGeom prst="rect">
+                      <a:avLst/>
+                    </a:prstGeom>
+                    <a:noFill/>
+                    <a:ln w="9525">
+                      <a:noFill/>
+                      <a:headEnd/>
+                      <a:tailEnd/>
+                    </a:ln>
+                  </pic:spPr>
+                </pic:pic>
+              </a:graphicData>
+            </a:graphic>
+          </wp:inline>
+        </w:drawing>
+      </w:r>
+    </w:p>
+    <w:p>
+      <w:pPr>
+        <w:pStyle w:val="ImageCaption"/>
+      </w:pPr>
+      <w:r>
+        <w:t xml:space="preserve">Statistical comparison of actin density in SMIFH2 treated cultures</w:t>
+      </w:r>
+    </w:p>
+    <w:p>
+      <w:pPr>
+        <w:pStyle w:val="CaptionedFigure"/>
+      </w:pPr>
+      <w:r>
+        <w:drawing>
+          <wp:inline>
+            <wp:extent cx="5969000" cy="4178300"/>
+            <wp:effectExtent b="0" l="0" r="0" t="0"/>
+            <wp:docPr descr="Actin density in the soma of SMIFH2 treated cultures" title="" id="60" name="Picture"/>
+            <a:graphic>
+              <a:graphicData uri="http://schemas.openxmlformats.org/drawingml/2006/picture">
+                <pic:pic>
+                  <pic:nvPicPr>
+                    <pic:cNvPr descr="mitochondria_alcohol_status_report_files/figure-docx/actin_in_SMIFH2-1.png" id="61" name="Picture"/>
+                    <pic:cNvPicPr>
+                      <a:picLocks noChangeArrowheads="1" noChangeAspect="1"/>
+                    </pic:cNvPicPr>
+                  </pic:nvPicPr>
+                  <pic:blipFill>
+                    <a:blip r:embed="rId59"/>
+                    <a:stretch>
+                      <a:fillRect/>
+                    </a:stretch>
+                  </pic:blipFill>
+                  <pic:spPr bwMode="auto">
+                    <a:xfrm>
+                      <a:off x="0" y="0"/>
+                      <a:ext cx="5969000" cy="4178300"/>
+                    </a:xfrm>
+                    <a:prstGeom prst="rect">
+                      <a:avLst/>
+                    </a:prstGeom>
+                    <a:noFill/>
+                    <a:ln w="9525">
+                      <a:noFill/>
+                      <a:headEnd/>
+                      <a:tailEnd/>
+                    </a:ln>
+                  </pic:spPr>
+                </pic:pic>
+              </a:graphicData>
+            </a:graphic>
+          </wp:inline>
+        </w:drawing>
+      </w:r>
+    </w:p>
+    <w:p>
+      <w:pPr>
+        <w:pStyle w:val="ImageCaption"/>
+      </w:pPr>
+      <w:r>
+        <w:t xml:space="preserve">Actin density in the soma of SMIFH2 treated cultures</w:t>
+      </w:r>
+    </w:p>
+    <w:p>
+      <w:pPr>
+        <w:pStyle w:val="Textkrper"/>
+      </w:pPr>
+      <w:r>
+        <w:t xml:space="preserve">As the sample size for SMIFH2 treated cultures is very low, the results here seem inconclusive. As SMIFH2 inhibits actin polymerization (Phalloidin Red only binds to polymerized actin), a decrease of actin density is expected but not apparent in the data.</w:t>
+      </w:r>
+    </w:p>
+    <w:bookmarkEnd w:id="62"/>
+    <w:bookmarkStart w:id="69" w:name="X5e9eb44fd81fbb9d6aa399327fbc04690067860"/>
+    <w:p>
+      <w:pPr>
+        <w:pStyle w:val="berschrift3"/>
+      </w:pPr>
+      <w:r>
+        <w:t xml:space="preserve">No relevant effect of Ethanol treatment (5min, 30mM) on somatic actin density</w:t>
+      </w:r>
+    </w:p>
+    <w:p>
+      <w:pPr>
+        <w:pStyle w:val="CaptionedFigure"/>
+      </w:pPr>
+      <w:r>
+        <w:drawing>
+          <wp:inline>
+            <wp:extent cx="5969000" cy="7022352"/>
+            <wp:effectExtent b="0" l="0" r="0" t="0"/>
+            <wp:docPr descr="Statistical comparison of actin density in ethanol treated cultures" title="" id="64" name="Picture"/>
+            <a:graphic>
+              <a:graphicData uri="http://schemas.openxmlformats.org/drawingml/2006/picture">
+                <pic:pic>
+                  <pic:nvPicPr>
+                    <pic:cNvPr descr="mitochondria_alcohol_status_report_files/figure-docx/comparison_actin_under_ethanol-1.png" id="65" name="Picture"/>
+                    <pic:cNvPicPr>
+                      <a:picLocks noChangeArrowheads="1" noChangeAspect="1"/>
+                    </pic:cNvPicPr>
+                  </pic:nvPicPr>
+                  <pic:blipFill>
+                    <a:blip r:embed="rId63"/>
+                    <a:stretch>
+                      <a:fillRect/>
+                    </a:stretch>
+                  </pic:blipFill>
+                  <pic:spPr bwMode="auto">
+                    <a:xfrm>
+                      <a:off x="0" y="0"/>
+                      <a:ext cx="5969000" cy="7022352"/>
+                    </a:xfrm>
+                    <a:prstGeom prst="rect">
+                      <a:avLst/>
+                    </a:prstGeom>
+                    <a:noFill/>
+                    <a:ln w="9525">
+                      <a:noFill/>
+                      <a:headEnd/>
+                      <a:tailEnd/>
+                    </a:ln>
+                  </pic:spPr>
+                </pic:pic>
+              </a:graphicData>
+            </a:graphic>
+          </wp:inline>
+        </w:drawing>
+      </w:r>
+    </w:p>
+    <w:p>
+      <w:pPr>
+        <w:pStyle w:val="ImageCaption"/>
+      </w:pPr>
+      <w:r>
+        <w:t xml:space="preserve">Statistical comparison of actin density in ethanol treated cultures</w:t>
+      </w:r>
+    </w:p>
+    <w:p>
+      <w:pPr>
+        <w:pStyle w:val="CaptionedFigure"/>
+      </w:pPr>
+      <w:r>
+        <w:drawing>
+          <wp:inline>
+            <wp:extent cx="5969000" cy="4178300"/>
+            <wp:effectExtent b="0" l="0" r="0" t="0"/>
+            <wp:docPr descr="Actin density in the soma of ethanol treated cultures" title="" id="67" name="Picture"/>
+            <a:graphic>
+              <a:graphicData uri="http://schemas.openxmlformats.org/drawingml/2006/picture">
+                <pic:pic>
+                  <pic:nvPicPr>
+                    <pic:cNvPr descr="mitochondria_alcohol_status_report_files/figure-docx/actin_in_ethanol-1.png" id="68" name="Picture"/>
+                    <pic:cNvPicPr>
+                      <a:picLocks noChangeArrowheads="1" noChangeAspect="1"/>
+                    </pic:cNvPicPr>
+                  </pic:nvPicPr>
+                  <pic:blipFill>
+                    <a:blip r:embed="rId66"/>
+                    <a:stretch>
+                      <a:fillRect/>
+                    </a:stretch>
+                  </pic:blipFill>
+                  <pic:spPr bwMode="auto">
+                    <a:xfrm>
+                      <a:off x="0" y="0"/>
+                      <a:ext cx="5969000" cy="4178300"/>
+                    </a:xfrm>
+                    <a:prstGeom prst="rect">
+                      <a:avLst/>
+                    </a:prstGeom>
+                    <a:noFill/>
+                    <a:ln w="9525">
+                      <a:noFill/>
+                      <a:headEnd/>
+                      <a:tailEnd/>
+                    </a:ln>
+                  </pic:spPr>
+                </pic:pic>
+              </a:graphicData>
+            </a:graphic>
+          </wp:inline>
+        </w:drawing>
+      </w:r>
+    </w:p>
+    <w:p>
+      <w:pPr>
+        <w:pStyle w:val="ImageCaption"/>
+      </w:pPr>
+      <w:r>
+        <w:t xml:space="preserve">Actin density in the soma of ethanol treated cultures</w:t>
+      </w:r>
+    </w:p>
+    <w:p>
+      <w:pPr>
+        <w:pStyle w:val="Textkrper"/>
+      </w:pPr>
+      <w:r>
+        <w:t xml:space="preserve">Although statistically significant, the effect sizes are marginal and thus, 5min Ethanol treatment (30mM) has no relevant effect on somatic actin density.</w:t>
+      </w:r>
+    </w:p>
+    <w:bookmarkEnd w:id="69"/>
+    <w:bookmarkEnd w:id="70"/>
+    <w:bookmarkStart w:id="74" w:name="references"/>
     <w:p>
       <w:pPr>
         <w:pStyle w:val="berschrift2"/>
       </w:pPr>
       <w:r>
-        <w:t xml:space="preserve">Next steps</w:t>
-      </w:r>
-    </w:p>
-    <w:p>
-      <w:pPr>
-        <w:numPr>
-          <w:ilvl w:val="0"/>
-          <w:numId w:val="1001"/>
-        </w:numPr>
-      </w:pPr>
-      <w:r>
-        <w:t xml:space="preserve">Imaging of all remaining samples (currently about 50% imaged and about 30% are analyzed)</w:t>
-      </w:r>
-    </w:p>
-    <w:p>
-      <w:pPr>
-        <w:numPr>
-          <w:ilvl w:val="0"/>
-          <w:numId w:val="1001"/>
-        </w:numPr>
-      </w:pPr>
-      <w:r>
-        <w:t xml:space="preserve">Treatment and staining of alcohol conditions</w:t>
-      </w:r>
-    </w:p>
-    <w:p>
-      <w:pPr>
-        <w:numPr>
-          <w:ilvl w:val="0"/>
-          <w:numId w:val="1001"/>
-        </w:numPr>
-      </w:pPr>
-      <w:r>
-        <w:t xml:space="preserve">More detailed statistical analysis</w:t>
-      </w:r>
-    </w:p>
-    <w:bookmarkEnd w:id="57"/>
-    <w:bookmarkStart w:id="61" w:name="references"/>
-    <w:p>
-      <w:pPr>
-        <w:pStyle w:val="berschrift2"/>
-      </w:pPr>
-      <w:r>
         <w:t xml:space="preserve">References</w:t>
       </w:r>
     </w:p>
-    <w:bookmarkStart w:id="60" w:name="refs"/>
-    <w:bookmarkStart w:id="59" w:name="X4175f2d6a880cff244f25bc9442830b9798b728"/>
+    <w:bookmarkStart w:id="73" w:name="refs"/>
+    <w:bookmarkStart w:id="72" w:name="X4175f2d6a880cff244f25bc9442830b9798b728"/>
     <w:p>
       <w:pPr>
         <w:pStyle w:val="Literaturverzeichnis"/>
@@ -1215,7 +1603,7 @@
       <w:r>
         <w:t xml:space="preserve"> </w:t>
       </w:r>
-      <w:hyperlink r:id="rId58">
+      <w:hyperlink r:id="rId71">
         <w:r>
           <w:rPr>
             <w:rStyle w:val="Hyperlink"/>
@@ -1227,9 +1615,9 @@
         <w:t xml:space="preserve">.</w:t>
       </w:r>
     </w:p>
-    <w:bookmarkEnd w:id="59"/>
-    <w:bookmarkEnd w:id="60"/>
-    <w:bookmarkEnd w:id="61"/>
+    <w:bookmarkEnd w:id="72"/>
+    <w:bookmarkEnd w:id="73"/>
+    <w:bookmarkEnd w:id="74"/>
     <w:sectPr>
       <w:pgSz w:h="15840" w:w="12240"/>
       <w:pgMar w:bottom="1134" w:footer="720" w:gutter="0" w:header="720" w:left="1417" w:right="1417" w:top="1417"/>
@@ -1683,91 +2071,6 @@
     <w:lvl w:ilvl="8">
       <w:numFmt w:val="bullet"/>
       <w:lvlText w:val=" "/>
-      <w:lvlJc w:val="left"/>
-      <w:pPr>
-        <w:ind w:left="6480" w:hanging="480"/>
-      </w:pPr>
-    </w:lvl>
-  </w:abstractNum>
-  <w:abstractNum w:abstractNumId="99411">
-    <w:nsid w:val="A99411"/>
-    <w:multiLevelType w:val="multilevel"/>
-    <w:lvl w:ilvl="0">
-      <w:start w:val="1"/>
-      <w:numFmt w:val="decimal"/>
-      <w:lvlText w:val="%1."/>
-      <w:lvlJc w:val="left"/>
-      <w:pPr>
-        <w:ind w:left="720" w:hanging="480"/>
-      </w:pPr>
-    </w:lvl>
-    <w:lvl w:ilvl="1">
-      <w:start w:val="1"/>
-      <w:numFmt w:val="decimal"/>
-      <w:lvlText w:val="%2."/>
-      <w:lvlJc w:val="left"/>
-      <w:pPr>
-        <w:ind w:left="1440" w:hanging="480"/>
-      </w:pPr>
-    </w:lvl>
-    <w:lvl w:ilvl="2">
-      <w:start w:val="1"/>
-      <w:numFmt w:val="decimal"/>
-      <w:lvlText w:val="%3."/>
-      <w:lvlJc w:val="left"/>
-      <w:pPr>
-        <w:ind w:left="2160" w:hanging="480"/>
-      </w:pPr>
-    </w:lvl>
-    <w:lvl w:ilvl="3">
-      <w:start w:val="1"/>
-      <w:numFmt w:val="decimal"/>
-      <w:lvlText w:val="%4."/>
-      <w:lvlJc w:val="left"/>
-      <w:pPr>
-        <w:ind w:left="2880" w:hanging="480"/>
-      </w:pPr>
-    </w:lvl>
-    <w:lvl w:ilvl="4">
-      <w:start w:val="1"/>
-      <w:numFmt w:val="decimal"/>
-      <w:lvlText w:val="%5."/>
-      <w:lvlJc w:val="left"/>
-      <w:pPr>
-        <w:ind w:left="3600" w:hanging="480"/>
-      </w:pPr>
-    </w:lvl>
-    <w:lvl w:ilvl="5">
-      <w:start w:val="1"/>
-      <w:numFmt w:val="decimal"/>
-      <w:lvlText w:val="%6."/>
-      <w:lvlJc w:val="left"/>
-      <w:pPr>
-        <w:ind w:left="4320" w:hanging="480"/>
-      </w:pPr>
-    </w:lvl>
-    <w:lvl w:ilvl="6">
-      <w:start w:val="1"/>
-      <w:numFmt w:val="decimal"/>
-      <w:lvlText w:val="%7."/>
-      <w:lvlJc w:val="left"/>
-      <w:pPr>
-        <w:ind w:left="5040" w:hanging="480"/>
-      </w:pPr>
-    </w:lvl>
-    <w:lvl w:ilvl="7">
-      <w:start w:val="1"/>
-      <w:numFmt w:val="decimal"/>
-      <w:lvlText w:val="%8."/>
-      <w:lvlJc w:val="left"/>
-      <w:pPr>
-        <w:ind w:left="5760" w:hanging="480"/>
-      </w:pPr>
-    </w:lvl>
-    <w:lvl w:ilvl="8">
-      <w:start w:val="1"/>
-      <w:numFmt w:val="decimal"/>
-      <w:lvlText w:val="%9."/>
       <w:lvlJc w:val="left"/>
       <w:pPr>
         <w:ind w:left="6480" w:hanging="480"/>
@@ -1839,36 +2142,6 @@
   </w:num>
   <w:num w:numId="1000">
     <w:abstractNumId w:val="990"/>
-  </w:num>
-  <w:num w:numId="1001">
-    <w:abstractNumId w:val="99411"/>
-    <w:lvlOverride w:ilvl="0">
-      <w:startOverride w:val="1"/>
-    </w:lvlOverride>
-    <w:lvlOverride w:ilvl="1">
-      <w:startOverride w:val="1"/>
-    </w:lvlOverride>
-    <w:lvlOverride w:ilvl="2">
-      <w:startOverride w:val="1"/>
-    </w:lvlOverride>
-    <w:lvlOverride w:ilvl="3">
-      <w:startOverride w:val="1"/>
-    </w:lvlOverride>
-    <w:lvlOverride w:ilvl="4">
-      <w:startOverride w:val="1"/>
-    </w:lvlOverride>
-    <w:lvlOverride w:ilvl="5">
-      <w:startOverride w:val="1"/>
-    </w:lvlOverride>
-    <w:lvlOverride w:ilvl="6">
-      <w:startOverride w:val="1"/>
-    </w:lvlOverride>
-    <w:lvlOverride w:ilvl="7">
-      <w:startOverride w:val="1"/>
-    </w:lvlOverride>
-    <w:lvlOverride w:ilvl="8">
-      <w:startOverride w:val="1"/>
-    </w:lvlOverride>
   </w:num>
 </w:numbering>
 </file>

</xml_diff>

<commit_message>
Finished analysis of all pre-existing samples
</commit_message>
<xml_diff>
--- a/Results/Mitosections/mitochondria_alcohol_status_report.docx
+++ b/Results/Mitosections/mitochondria_alcohol_status_report.docx
@@ -91,7 +91,7 @@
         <w:pStyle w:val="Datum"/>
       </w:pPr>
       <w:r>
-        <w:t xml:space="preserve">2023-05-23</w:t>
+        <w:t xml:space="preserve">2023-05-24</w:t>
       </w:r>
     </w:p>
     <w:bookmarkStart w:id="28" w:name="introduction"/>
@@ -1018,7 +1018,7 @@
     </w:p>
     <w:bookmarkEnd w:id="40"/>
     <w:bookmarkEnd w:id="41"/>
-    <w:bookmarkStart w:id="70" w:name="current-results"/>
+    <w:bookmarkStart w:id="98" w:name="current-results"/>
     <w:p>
       <w:pPr>
         <w:pStyle w:val="berschrift2"/>
@@ -1539,8 +1539,520 @@
       </w:r>
     </w:p>
     <w:bookmarkEnd w:id="69"/>
-    <w:bookmarkEnd w:id="70"/>
-    <w:bookmarkStart w:id="74" w:name="references"/>
+    <w:bookmarkStart w:id="76" w:name="X5154b24c9de155c97902dacf40110dfc1163ac8"/>
+    <w:p>
+      <w:pPr>
+        <w:pStyle w:val="berschrift3"/>
+      </w:pPr>
+      <w:r>
+        <w:t xml:space="preserve">Activin A might shift somatic mitochondria distribution towards the nucleus</w:t>
+      </w:r>
+    </w:p>
+    <w:p>
+      <w:pPr>
+        <w:pStyle w:val="CaptionedFigure"/>
+      </w:pPr>
+      <w:r>
+        <w:drawing>
+          <wp:inline>
+            <wp:extent cx="5969000" cy="7022352"/>
+            <wp:effectExtent b="0" l="0" r="0" t="0"/>
+            <wp:docPr descr="Statistical comparison of mitochondria distribution in Activin A treated cultures" title="" id="71" name="Picture"/>
+            <a:graphic>
+              <a:graphicData uri="http://schemas.openxmlformats.org/drawingml/2006/picture">
+                <pic:pic>
+                  <pic:nvPicPr>
+                    <pic:cNvPr descr="mitochondria_alcohol_status_report_files/figure-docx/comparison_mitochondria_under_activin-1.png" id="72" name="Picture"/>
+                    <pic:cNvPicPr>
+                      <a:picLocks noChangeArrowheads="1" noChangeAspect="1"/>
+                    </pic:cNvPicPr>
+                  </pic:nvPicPr>
+                  <pic:blipFill>
+                    <a:blip r:embed="rId70"/>
+                    <a:stretch>
+                      <a:fillRect/>
+                    </a:stretch>
+                  </pic:blipFill>
+                  <pic:spPr bwMode="auto">
+                    <a:xfrm>
+                      <a:off x="0" y="0"/>
+                      <a:ext cx="5969000" cy="7022352"/>
+                    </a:xfrm>
+                    <a:prstGeom prst="rect">
+                      <a:avLst/>
+                    </a:prstGeom>
+                    <a:noFill/>
+                    <a:ln w="9525">
+                      <a:noFill/>
+                      <a:headEnd/>
+                      <a:tailEnd/>
+                    </a:ln>
+                  </pic:spPr>
+                </pic:pic>
+              </a:graphicData>
+            </a:graphic>
+          </wp:inline>
+        </w:drawing>
+      </w:r>
+    </w:p>
+    <w:p>
+      <w:pPr>
+        <w:pStyle w:val="ImageCaption"/>
+      </w:pPr>
+      <w:r>
+        <w:t xml:space="preserve">Statistical comparison of mitochondria distribution in Activin A treated cultures</w:t>
+      </w:r>
+    </w:p>
+    <w:p>
+      <w:pPr>
+        <w:pStyle w:val="CaptionedFigure"/>
+      </w:pPr>
+      <w:r>
+        <w:drawing>
+          <wp:inline>
+            <wp:extent cx="5969000" cy="4178300"/>
+            <wp:effectExtent b="0" l="0" r="0" t="0"/>
+            <wp:docPr descr="Mitochondria population in the soma of Activin A treated cultures" title="" id="74" name="Picture"/>
+            <a:graphic>
+              <a:graphicData uri="http://schemas.openxmlformats.org/drawingml/2006/picture">
+                <pic:pic>
+                  <pic:nvPicPr>
+                    <pic:cNvPr descr="mitochondria_alcohol_status_report_files/figure-docx/mitochondria_in_activin-1.png" id="75" name="Picture"/>
+                    <pic:cNvPicPr>
+                      <a:picLocks noChangeArrowheads="1" noChangeAspect="1"/>
+                    </pic:cNvPicPr>
+                  </pic:nvPicPr>
+                  <pic:blipFill>
+                    <a:blip r:embed="rId73"/>
+                    <a:stretch>
+                      <a:fillRect/>
+                    </a:stretch>
+                  </pic:blipFill>
+                  <pic:spPr bwMode="auto">
+                    <a:xfrm>
+                      <a:off x="0" y="0"/>
+                      <a:ext cx="5969000" cy="4178300"/>
+                    </a:xfrm>
+                    <a:prstGeom prst="rect">
+                      <a:avLst/>
+                    </a:prstGeom>
+                    <a:noFill/>
+                    <a:ln w="9525">
+                      <a:noFill/>
+                      <a:headEnd/>
+                      <a:tailEnd/>
+                    </a:ln>
+                  </pic:spPr>
+                </pic:pic>
+              </a:graphicData>
+            </a:graphic>
+          </wp:inline>
+        </w:drawing>
+      </w:r>
+    </w:p>
+    <w:p>
+      <w:pPr>
+        <w:pStyle w:val="ImageCaption"/>
+      </w:pPr>
+      <w:r>
+        <w:t xml:space="preserve">Mitochondria population in the soma of Activin A treated cultures</w:t>
+      </w:r>
+    </w:p>
+    <w:p>
+      <w:pPr>
+        <w:pStyle w:val="Textkrper"/>
+      </w:pPr>
+      <w:r>
+        <w:t xml:space="preserve">As the actin filaments, somatic mitochondria population is affected by Activin A treatment after 2 days and 14 days, but not after 4days and 10 days. The somatic mitochondria population seems to be pulled closer to the nucleus after Activin A treatment - the mitochondria density is increased near the nucleus (sections 1-3) and decreased in the distal sections (sections 8-10). These results might arise from increased mitochondria formation near the nucleus and/ or abandoned mitochondria maintenance and dissolution in the distal soma.</w:t>
+      </w:r>
+    </w:p>
+    <w:bookmarkEnd w:id="76"/>
+    <w:bookmarkStart w:id="83" w:name="effect-of-follistatin-on-mitochondria"/>
+    <w:p>
+      <w:pPr>
+        <w:pStyle w:val="berschrift3"/>
+      </w:pPr>
+      <w:r>
+        <w:t xml:space="preserve">Effect of follistatin on mitochondria</w:t>
+      </w:r>
+    </w:p>
+    <w:p>
+      <w:pPr>
+        <w:pStyle w:val="CaptionedFigure"/>
+      </w:pPr>
+      <w:r>
+        <w:drawing>
+          <wp:inline>
+            <wp:extent cx="5969000" cy="7022352"/>
+            <wp:effectExtent b="0" l="0" r="0" t="0"/>
+            <wp:docPr descr="Statistical comparison of mitochondria distribution in follistatin treated cultures" title="" id="78" name="Picture"/>
+            <a:graphic>
+              <a:graphicData uri="http://schemas.openxmlformats.org/drawingml/2006/picture">
+                <pic:pic>
+                  <pic:nvPicPr>
+                    <pic:cNvPr descr="mitochondria_alcohol_status_report_files/figure-docx/comparison_mitochondria_under_follistatin-1.png" id="79" name="Picture"/>
+                    <pic:cNvPicPr>
+                      <a:picLocks noChangeArrowheads="1" noChangeAspect="1"/>
+                    </pic:cNvPicPr>
+                  </pic:nvPicPr>
+                  <pic:blipFill>
+                    <a:blip r:embed="rId77"/>
+                    <a:stretch>
+                      <a:fillRect/>
+                    </a:stretch>
+                  </pic:blipFill>
+                  <pic:spPr bwMode="auto">
+                    <a:xfrm>
+                      <a:off x="0" y="0"/>
+                      <a:ext cx="5969000" cy="7022352"/>
+                    </a:xfrm>
+                    <a:prstGeom prst="rect">
+                      <a:avLst/>
+                    </a:prstGeom>
+                    <a:noFill/>
+                    <a:ln w="9525">
+                      <a:noFill/>
+                      <a:headEnd/>
+                      <a:tailEnd/>
+                    </a:ln>
+                  </pic:spPr>
+                </pic:pic>
+              </a:graphicData>
+            </a:graphic>
+          </wp:inline>
+        </w:drawing>
+      </w:r>
+    </w:p>
+    <w:p>
+      <w:pPr>
+        <w:pStyle w:val="ImageCaption"/>
+      </w:pPr>
+      <w:r>
+        <w:t xml:space="preserve">Statistical comparison of mitochondria distribution in follistatin treated cultures</w:t>
+      </w:r>
+    </w:p>
+    <w:p>
+      <w:pPr>
+        <w:pStyle w:val="CaptionedFigure"/>
+      </w:pPr>
+      <w:r>
+        <w:drawing>
+          <wp:inline>
+            <wp:extent cx="5969000" cy="4178300"/>
+            <wp:effectExtent b="0" l="0" r="0" t="0"/>
+            <wp:docPr descr="Mitochondria population in the soma of follistatin treated cultures" title="" id="81" name="Picture"/>
+            <a:graphic>
+              <a:graphicData uri="http://schemas.openxmlformats.org/drawingml/2006/picture">
+                <pic:pic>
+                  <pic:nvPicPr>
+                    <pic:cNvPr descr="mitochondria_alcohol_status_report_files/figure-docx/mitochondria_in_follistatin-1.png" id="82" name="Picture"/>
+                    <pic:cNvPicPr>
+                      <a:picLocks noChangeArrowheads="1" noChangeAspect="1"/>
+                    </pic:cNvPicPr>
+                  </pic:nvPicPr>
+                  <pic:blipFill>
+                    <a:blip r:embed="rId80"/>
+                    <a:stretch>
+                      <a:fillRect/>
+                    </a:stretch>
+                  </pic:blipFill>
+                  <pic:spPr bwMode="auto">
+                    <a:xfrm>
+                      <a:off x="0" y="0"/>
+                      <a:ext cx="5969000" cy="4178300"/>
+                    </a:xfrm>
+                    <a:prstGeom prst="rect">
+                      <a:avLst/>
+                    </a:prstGeom>
+                    <a:noFill/>
+                    <a:ln w="9525">
+                      <a:noFill/>
+                      <a:headEnd/>
+                      <a:tailEnd/>
+                    </a:ln>
+                  </pic:spPr>
+                </pic:pic>
+              </a:graphicData>
+            </a:graphic>
+          </wp:inline>
+        </w:drawing>
+      </w:r>
+    </w:p>
+    <w:p>
+      <w:pPr>
+        <w:pStyle w:val="ImageCaption"/>
+      </w:pPr>
+      <w:r>
+        <w:t xml:space="preserve">Mitochondria population in the soma of follistatin treated cultures</w:t>
+      </w:r>
+    </w:p>
+    <w:p>
+      <w:pPr>
+        <w:pStyle w:val="Textkrper"/>
+      </w:pPr>
+      <w:r>
+        <w:t xml:space="preserve">The somatic mitochondria population is increased after treatment with follistatin for 7, 10 and 14 days.</w:t>
+      </w:r>
+    </w:p>
+    <w:bookmarkEnd w:id="83"/>
+    <w:bookmarkStart w:id="90" w:name="effect-of-smifh2-on-mitochondria"/>
+    <w:p>
+      <w:pPr>
+        <w:pStyle w:val="berschrift3"/>
+      </w:pPr>
+      <w:r>
+        <w:t xml:space="preserve">Effect of SMIFH2 on mitochondria</w:t>
+      </w:r>
+    </w:p>
+    <w:p>
+      <w:pPr>
+        <w:pStyle w:val="CaptionedFigure"/>
+      </w:pPr>
+      <w:r>
+        <w:drawing>
+          <wp:inline>
+            <wp:extent cx="5969000" cy="7022352"/>
+            <wp:effectExtent b="0" l="0" r="0" t="0"/>
+            <wp:docPr descr="Statistical comparison of mitochondria distribution in SMIFH2 treated cultures" title="" id="85" name="Picture"/>
+            <a:graphic>
+              <a:graphicData uri="http://schemas.openxmlformats.org/drawingml/2006/picture">
+                <pic:pic>
+                  <pic:nvPicPr>
+                    <pic:cNvPr descr="mitochondria_alcohol_status_report_files/figure-docx/comparison_mitochondria_under_SMIFH2-1.png" id="86" name="Picture"/>
+                    <pic:cNvPicPr>
+                      <a:picLocks noChangeArrowheads="1" noChangeAspect="1"/>
+                    </pic:cNvPicPr>
+                  </pic:nvPicPr>
+                  <pic:blipFill>
+                    <a:blip r:embed="rId84"/>
+                    <a:stretch>
+                      <a:fillRect/>
+                    </a:stretch>
+                  </pic:blipFill>
+                  <pic:spPr bwMode="auto">
+                    <a:xfrm>
+                      <a:off x="0" y="0"/>
+                      <a:ext cx="5969000" cy="7022352"/>
+                    </a:xfrm>
+                    <a:prstGeom prst="rect">
+                      <a:avLst/>
+                    </a:prstGeom>
+                    <a:noFill/>
+                    <a:ln w="9525">
+                      <a:noFill/>
+                      <a:headEnd/>
+                      <a:tailEnd/>
+                    </a:ln>
+                  </pic:spPr>
+                </pic:pic>
+              </a:graphicData>
+            </a:graphic>
+          </wp:inline>
+        </w:drawing>
+      </w:r>
+    </w:p>
+    <w:p>
+      <w:pPr>
+        <w:pStyle w:val="ImageCaption"/>
+      </w:pPr>
+      <w:r>
+        <w:t xml:space="preserve">Statistical comparison of mitochondria distribution in SMIFH2 treated cultures</w:t>
+      </w:r>
+    </w:p>
+    <w:p>
+      <w:pPr>
+        <w:pStyle w:val="CaptionedFigure"/>
+      </w:pPr>
+      <w:r>
+        <w:drawing>
+          <wp:inline>
+            <wp:extent cx="5969000" cy="4178300"/>
+            <wp:effectExtent b="0" l="0" r="0" t="0"/>
+            <wp:docPr descr="Mitochondria population in the soma of SMIFH2 treated cultures" title="" id="88" name="Picture"/>
+            <a:graphic>
+              <a:graphicData uri="http://schemas.openxmlformats.org/drawingml/2006/picture">
+                <pic:pic>
+                  <pic:nvPicPr>
+                    <pic:cNvPr descr="mitochondria_alcohol_status_report_files/figure-docx/mitochondria_in_SMIFH2-1.png" id="89" name="Picture"/>
+                    <pic:cNvPicPr>
+                      <a:picLocks noChangeArrowheads="1" noChangeAspect="1"/>
+                    </pic:cNvPicPr>
+                  </pic:nvPicPr>
+                  <pic:blipFill>
+                    <a:blip r:embed="rId87"/>
+                    <a:stretch>
+                      <a:fillRect/>
+                    </a:stretch>
+                  </pic:blipFill>
+                  <pic:spPr bwMode="auto">
+                    <a:xfrm>
+                      <a:off x="0" y="0"/>
+                      <a:ext cx="5969000" cy="4178300"/>
+                    </a:xfrm>
+                    <a:prstGeom prst="rect">
+                      <a:avLst/>
+                    </a:prstGeom>
+                    <a:noFill/>
+                    <a:ln w="9525">
+                      <a:noFill/>
+                      <a:headEnd/>
+                      <a:tailEnd/>
+                    </a:ln>
+                  </pic:spPr>
+                </pic:pic>
+              </a:graphicData>
+            </a:graphic>
+          </wp:inline>
+        </w:drawing>
+      </w:r>
+    </w:p>
+    <w:p>
+      <w:pPr>
+        <w:pStyle w:val="ImageCaption"/>
+      </w:pPr>
+      <w:r>
+        <w:t xml:space="preserve">Mitochondria population in the soma of SMIFH2 treated cultures</w:t>
+      </w:r>
+    </w:p>
+    <w:p>
+      <w:pPr>
+        <w:pStyle w:val="Textkrper"/>
+      </w:pPr>
+      <w:r>
+        <w:t xml:space="preserve">Although the sample size is still low, it seems that in the long-term, after 14 days of treatment with SMIFH2, the mitochondria density in the neuronal soma is increased. This might be due to a reduced export into neurites.</w:t>
+      </w:r>
+    </w:p>
+    <w:bookmarkEnd w:id="90"/>
+    <w:bookmarkStart w:id="97" w:name="effect-of-ethanol-on-mitochondria"/>
+    <w:p>
+      <w:pPr>
+        <w:pStyle w:val="berschrift3"/>
+      </w:pPr>
+      <w:r>
+        <w:t xml:space="preserve">Effect of ethanol on mitochondria</w:t>
+      </w:r>
+    </w:p>
+    <w:p>
+      <w:pPr>
+        <w:pStyle w:val="CaptionedFigure"/>
+      </w:pPr>
+      <w:r>
+        <w:drawing>
+          <wp:inline>
+            <wp:extent cx="5969000" cy="7022352"/>
+            <wp:effectExtent b="0" l="0" r="0" t="0"/>
+            <wp:docPr descr="Statistical comparison of mitochondria distribution in ethanol treated cultures" title="" id="92" name="Picture"/>
+            <a:graphic>
+              <a:graphicData uri="http://schemas.openxmlformats.org/drawingml/2006/picture">
+                <pic:pic>
+                  <pic:nvPicPr>
+                    <pic:cNvPr descr="mitochondria_alcohol_status_report_files/figure-docx/comparison_mitochondria_under_ethanol-1.png" id="93" name="Picture"/>
+                    <pic:cNvPicPr>
+                      <a:picLocks noChangeArrowheads="1" noChangeAspect="1"/>
+                    </pic:cNvPicPr>
+                  </pic:nvPicPr>
+                  <pic:blipFill>
+                    <a:blip r:embed="rId91"/>
+                    <a:stretch>
+                      <a:fillRect/>
+                    </a:stretch>
+                  </pic:blipFill>
+                  <pic:spPr bwMode="auto">
+                    <a:xfrm>
+                      <a:off x="0" y="0"/>
+                      <a:ext cx="5969000" cy="7022352"/>
+                    </a:xfrm>
+                    <a:prstGeom prst="rect">
+                      <a:avLst/>
+                    </a:prstGeom>
+                    <a:noFill/>
+                    <a:ln w="9525">
+                      <a:noFill/>
+                      <a:headEnd/>
+                      <a:tailEnd/>
+                    </a:ln>
+                  </pic:spPr>
+                </pic:pic>
+              </a:graphicData>
+            </a:graphic>
+          </wp:inline>
+        </w:drawing>
+      </w:r>
+    </w:p>
+    <w:p>
+      <w:pPr>
+        <w:pStyle w:val="ImageCaption"/>
+      </w:pPr>
+      <w:r>
+        <w:t xml:space="preserve">Statistical comparison of mitochondria distribution in ethanol treated cultures</w:t>
+      </w:r>
+    </w:p>
+    <w:p>
+      <w:pPr>
+        <w:pStyle w:val="CaptionedFigure"/>
+      </w:pPr>
+      <w:r>
+        <w:drawing>
+          <wp:inline>
+            <wp:extent cx="5969000" cy="4178300"/>
+            <wp:effectExtent b="0" l="0" r="0" t="0"/>
+            <wp:docPr descr="Mitochondria population in the soma of ethanol treated cultures" title="" id="95" name="Picture"/>
+            <a:graphic>
+              <a:graphicData uri="http://schemas.openxmlformats.org/drawingml/2006/picture">
+                <pic:pic>
+                  <pic:nvPicPr>
+                    <pic:cNvPr descr="mitochondria_alcohol_status_report_files/figure-docx/mitochondria_in_ethanol-1.png" id="96" name="Picture"/>
+                    <pic:cNvPicPr>
+                      <a:picLocks noChangeArrowheads="1" noChangeAspect="1"/>
+                    </pic:cNvPicPr>
+                  </pic:nvPicPr>
+                  <pic:blipFill>
+                    <a:blip r:embed="rId94"/>
+                    <a:stretch>
+                      <a:fillRect/>
+                    </a:stretch>
+                  </pic:blipFill>
+                  <pic:spPr bwMode="auto">
+                    <a:xfrm>
+                      <a:off x="0" y="0"/>
+                      <a:ext cx="5969000" cy="4178300"/>
+                    </a:xfrm>
+                    <a:prstGeom prst="rect">
+                      <a:avLst/>
+                    </a:prstGeom>
+                    <a:noFill/>
+                    <a:ln w="9525">
+                      <a:noFill/>
+                      <a:headEnd/>
+                      <a:tailEnd/>
+                    </a:ln>
+                  </pic:spPr>
+                </pic:pic>
+              </a:graphicData>
+            </a:graphic>
+          </wp:inline>
+        </w:drawing>
+      </w:r>
+    </w:p>
+    <w:p>
+      <w:pPr>
+        <w:pStyle w:val="ImageCaption"/>
+      </w:pPr>
+      <w:r>
+        <w:t xml:space="preserve">Mitochondria population in the soma of ethanol treated cultures</w:t>
+      </w:r>
+    </w:p>
+    <w:p>
+      <w:pPr>
+        <w:pStyle w:val="Textkrper"/>
+      </w:pPr>
+      <w:r>
+        <w:t xml:space="preserve">Ethanol might lead to a distal reducing of somatic mitochondria density. More experiments are required.</w:t>
+      </w:r>
+    </w:p>
+    <w:bookmarkEnd w:id="97"/>
+    <w:bookmarkEnd w:id="98"/>
+    <w:bookmarkStart w:id="102" w:name="references"/>
     <w:p>
       <w:pPr>
         <w:pStyle w:val="berschrift2"/>
@@ -1549,8 +2061,8 @@
         <w:t xml:space="preserve">References</w:t>
       </w:r>
     </w:p>
-    <w:bookmarkStart w:id="73" w:name="refs"/>
-    <w:bookmarkStart w:id="72" w:name="X4175f2d6a880cff244f25bc9442830b9798b728"/>
+    <w:bookmarkStart w:id="101" w:name="refs"/>
+    <w:bookmarkStart w:id="100" w:name="X4175f2d6a880cff244f25bc9442830b9798b728"/>
     <w:p>
       <w:pPr>
         <w:pStyle w:val="Literaturverzeichnis"/>
@@ -1603,7 +2115,7 @@
       <w:r>
         <w:t xml:space="preserve"> </w:t>
       </w:r>
-      <w:hyperlink r:id="rId71">
+      <w:hyperlink r:id="rId99">
         <w:r>
           <w:rPr>
             <w:rStyle w:val="Hyperlink"/>
@@ -1615,9 +2127,9 @@
         <w:t xml:space="preserve">.</w:t>
       </w:r>
     </w:p>
-    <w:bookmarkEnd w:id="72"/>
-    <w:bookmarkEnd w:id="73"/>
-    <w:bookmarkEnd w:id="74"/>
+    <w:bookmarkEnd w:id="100"/>
+    <w:bookmarkEnd w:id="101"/>
+    <w:bookmarkEnd w:id="102"/>
     <w:sectPr>
       <w:pgSz w:h="15840" w:w="12240"/>
       <w:pgMar w:bottom="1134" w:footer="720" w:gutter="0" w:header="720" w:left="1417" w:right="1417" w:top="1417"/>

</xml_diff>